<commit_message>
test : recette fonctionnelle 2.5.5
</commit_message>
<xml_diff>
--- a/Linux Windows PowerShell.docx
+++ b/Linux Windows PowerShell.docx
@@ -101,15 +101,7 @@
       </w:r>
       <w:proofErr w:type="spellEnd"/>
       <w:r>
-        <w:t xml:space="preserve"> &lt;</w:t>
-      </w:r>
-      <w:proofErr w:type="spellStart"/>
-      <w:r>
-        <w:t>Distro</w:t>
-      </w:r>
-      <w:proofErr w:type="spellEnd"/>
-      <w:r>
-        <w:t>&gt;'.</w:t>
+        <w:t xml:space="preserve"> &lt;Distro&gt;'.</w:t>
       </w:r>
     </w:p>
     <w:p/>
@@ -3662,11 +3654,17 @@
     <w:p>
       <w:pPr>
         <w:rPr>
-          <w:lang w:val="en-CA"/>
-        </w:rPr>
-      </w:pPr>
-      <w:r>
-        <w:rPr>
+          <w:b/>
+          <w:bCs/>
+          <w:color w:val="EE0000"/>
+          <w:lang w:val="en-CA"/>
+        </w:rPr>
+      </w:pPr>
+      <w:r>
+        <w:rPr>
+          <w:b/>
+          <w:bCs/>
+          <w:color w:val="EE0000"/>
           <w:lang w:val="en-CA"/>
         </w:rPr>
         <w:t>PS D:\update&gt; wsl -d Ubuntu-24.04</w:t>

</xml_diff>